<commit_message>
feat: Task 2.3 added chore: AI_USAGE.md, ANSWERS.md, ASSUMPTIONS.md updated
</commit_message>
<xml_diff>
--- a/docs/Разбор задания.docx
+++ b/docs/Разбор задания.docx
@@ -3897,26 +3897,6 @@
         <w:t xml:space="preserve"> так же заменяем нулями.</w:t>
       </w:r>
     </w:p>
-    <w:p>
-      <w:r>
-        <w:rPr>
-          <w:lang w:val="ru-UA"/>
-        </w:rPr>
-        <w:t xml:space="preserve">Неопределенность – в будущем могут прийти данные по отсутствующим дням и скользящее среднее </w:t>
-      </w:r>
-      <w:r>
-        <w:rPr>
-          <w:lang w:val="ru-UA"/>
-        </w:rPr>
-        <w:t>изменится задним</w:t>
-      </w:r>
-      <w:r>
-        <w:rPr>
-          <w:lang w:val="ru-UA"/>
-        </w:rPr>
-        <w:t xml:space="preserve"> числом.</w:t>
-      </w:r>
-    </w:p>
     <w:bookmarkEnd w:id="3"/>
     <w:p>
       <w:pPr>
@@ -4340,6 +4320,7 @@
         </w:rPr>
       </w:pPr>
       <w:proofErr w:type="spellStart"/>
+      <w:proofErr w:type="gramStart"/>
       <w:r>
         <w:rPr>
           <w:lang w:val="ru-UA"/>
@@ -4351,7 +4332,14 @@
         <w:rPr>
           <w:lang w:val="ru-UA"/>
         </w:rPr>
-        <w:t xml:space="preserve"> &gt; 0</w:t>
+        <w:t xml:space="preserve"> &gt;</w:t>
+      </w:r>
+      <w:proofErr w:type="gramEnd"/>
+      <w:r>
+        <w:rPr>
+          <w:lang w:val="ru-UA"/>
+        </w:rPr>
+        <w:t xml:space="preserve"> 0</w:t>
       </w:r>
     </w:p>
     <w:p>
@@ -4672,27 +4660,27 @@
         <w:rPr>
           <w:lang w:val="ru-UA"/>
         </w:rPr>
+        <w:t>cost</w:t>
+      </w:r>
+      <w:proofErr w:type="spellEnd"/>
+      <w:r>
+        <w:rPr>
+          <w:lang w:val="ru-UA"/>
+        </w:rPr>
+        <w:t xml:space="preserve"> = 0</w:t>
+      </w:r>
+    </w:p>
+    <w:p>
+      <w:pPr>
+        <w:rPr>
+          <w:lang w:val="ru-UA"/>
+        </w:rPr>
+      </w:pPr>
+      <w:r>
+        <w:rPr>
+          <w:lang w:val="ru-UA"/>
+        </w:rPr>
         <w:lastRenderedPageBreak/>
-        <w:t>cost</w:t>
-      </w:r>
-      <w:proofErr w:type="spellEnd"/>
-      <w:r>
-        <w:rPr>
-          <w:lang w:val="ru-UA"/>
-        </w:rPr>
-        <w:t xml:space="preserve"> = 0</w:t>
-      </w:r>
-    </w:p>
-    <w:p>
-      <w:pPr>
-        <w:rPr>
-          <w:lang w:val="ru-UA"/>
-        </w:rPr>
-      </w:pPr>
-      <w:r>
-        <w:rPr>
-          <w:lang w:val="ru-UA"/>
-        </w:rPr>
         <w:t>чтобы избежать ошибки.</w:t>
       </w:r>
     </w:p>
@@ -5508,7 +5496,6 @@
         <w:rPr>
           <w:lang w:val="ru-UA"/>
         </w:rPr>
-        <w:lastRenderedPageBreak/>
         <w:t>Варианты</w:t>
       </w:r>
       <w:r>
@@ -5667,10 +5654,12 @@
         <w:t xml:space="preserve"> – использовать для подсчетов количества аномалий </w:t>
       </w:r>
       <w:proofErr w:type="spellStart"/>
+      <w:proofErr w:type="gramStart"/>
       <w:r>
         <w:t>collections.Counter</w:t>
       </w:r>
       <w:proofErr w:type="spellEnd"/>
+      <w:proofErr w:type="gramEnd"/>
       <w:r>
         <w:rPr>
           <w:lang w:val="ru-UA"/>
@@ -5725,8 +5714,13 @@
         </w:rPr>
         <w:t xml:space="preserve"> – функция </w:t>
       </w:r>
-      <w:r>
-        <w:t xml:space="preserve">float() </w:t>
+      <w:proofErr w:type="gramStart"/>
+      <w:r>
+        <w:t>float(</w:t>
+      </w:r>
+      <w:proofErr w:type="gramEnd"/>
+      <w:r>
+        <w:t xml:space="preserve">) </w:t>
       </w:r>
       <w:r>
         <w:rPr>
@@ -5895,7 +5889,15 @@
       </w:r>
       <w:proofErr w:type="spellEnd"/>
       <w:r>
-        <w:t>(country) != 2</w:t>
+        <w:t>(country</w:t>
+      </w:r>
+      <w:proofErr w:type="gramStart"/>
+      <w:r>
+        <w:t>) !</w:t>
+      </w:r>
+      <w:proofErr w:type="gramEnd"/>
+      <w:r>
+        <w:t>= 2</w:t>
       </w:r>
     </w:p>
     <w:p>
@@ -6260,21 +6262,21 @@
         <w:rPr>
           <w:lang w:val="ru-UA"/>
         </w:rPr>
+        <w:t>quarantine</w:t>
+      </w:r>
+      <w:proofErr w:type="spellEnd"/>
+    </w:p>
+    <w:p>
+      <w:pPr>
+        <w:rPr>
+          <w:lang w:val="ru-UA"/>
+        </w:rPr>
+      </w:pPr>
+      <w:r>
+        <w:rPr>
+          <w:lang w:val="ru-UA"/>
+        </w:rPr>
         <w:lastRenderedPageBreak/>
-        <w:t>quarantine</w:t>
-      </w:r>
-      <w:proofErr w:type="spellEnd"/>
-    </w:p>
-    <w:p>
-      <w:pPr>
-        <w:rPr>
-          <w:lang w:val="ru-UA"/>
-        </w:rPr>
-      </w:pPr>
-      <w:r>
-        <w:rPr>
-          <w:lang w:val="ru-UA"/>
-        </w:rPr>
         <w:t>а не быть молча удалены.</w:t>
       </w:r>
     </w:p>
@@ -7215,24 +7217,24 @@
         <w:rPr>
           <w:lang w:val="ru-UA"/>
         </w:rPr>
+        <w:t>Нужно найти проблемы в порядке:</w:t>
+      </w:r>
+    </w:p>
+    <w:p>
+      <w:pPr>
+        <w:rPr>
+          <w:b/>
+          <w:bCs/>
+          <w:lang w:val="ru-UA"/>
+        </w:rPr>
+      </w:pPr>
+      <w:r>
+        <w:rPr>
+          <w:b/>
+          <w:bCs/>
+          <w:lang w:val="ru-UA"/>
+        </w:rPr>
         <w:lastRenderedPageBreak/>
-        <w:t>Нужно найти проблемы в порядке:</w:t>
-      </w:r>
-    </w:p>
-    <w:p>
-      <w:pPr>
-        <w:rPr>
-          <w:b/>
-          <w:bCs/>
-          <w:lang w:val="ru-UA"/>
-        </w:rPr>
-      </w:pPr>
-      <w:r>
-        <w:rPr>
-          <w:b/>
-          <w:bCs/>
-          <w:lang w:val="ru-UA"/>
-        </w:rPr>
         <w:t xml:space="preserve">1. </w:t>
       </w:r>
       <w:proofErr w:type="spellStart"/>
@@ -7923,7 +7925,6 @@
         <w:rPr>
           <w:lang w:val="ru-UA"/>
         </w:rPr>
-        <w:lastRenderedPageBreak/>
         <w:t>новые строки использовать с новым названием;</w:t>
       </w:r>
     </w:p>
@@ -7941,6 +7942,7 @@
         <w:rPr>
           <w:lang w:val="ru-UA"/>
         </w:rPr>
+        <w:lastRenderedPageBreak/>
         <w:t>объяснить влияние решения на сложность запросов.</w:t>
       </w:r>
     </w:p>
@@ -8641,20 +8643,20 @@
         <w:rPr>
           <w:lang w:val="ru-UA"/>
         </w:rPr>
+        <w:t>какой тип запросов станет медленнее.</w:t>
+      </w:r>
+    </w:p>
+    <w:p>
+      <w:pPr>
+        <w:rPr>
+          <w:lang w:val="ru-UA"/>
+        </w:rPr>
+      </w:pPr>
+      <w:r>
+        <w:rPr>
+          <w:lang w:val="ru-UA"/>
+        </w:rPr>
         <w:lastRenderedPageBreak/>
-        <w:t>какой тип запросов станет медленнее.</w:t>
-      </w:r>
-    </w:p>
-    <w:p>
-      <w:pPr>
-        <w:rPr>
-          <w:lang w:val="ru-UA"/>
-        </w:rPr>
-      </w:pPr>
-      <w:r>
-        <w:rPr>
-          <w:lang w:val="ru-UA"/>
-        </w:rPr>
         <w:pict w14:anchorId="57033048">
           <v:rect id="_x0000_i1045" style="width:0;height:1.5pt" o:hralign="center" o:hrstd="t" o:hr="t" fillcolor="#a0a0a0" stroked="f"/>
         </w:pict>
@@ -8863,7 +8865,21 @@
         <w:rPr>
           <w:lang w:val="ru-UA"/>
         </w:rPr>
-        <w:t>если NO  → что это означает</w:t>
+        <w:t xml:space="preserve">если </w:t>
+      </w:r>
+      <w:proofErr w:type="gramStart"/>
+      <w:r>
+        <w:rPr>
+          <w:lang w:val="ru-UA"/>
+        </w:rPr>
+        <w:t>NO  →</w:t>
+      </w:r>
+      <w:proofErr w:type="gramEnd"/>
+      <w:r>
+        <w:rPr>
+          <w:lang w:val="ru-UA"/>
+        </w:rPr>
+        <w:t xml:space="preserve"> что это означает</w:t>
       </w:r>
     </w:p>
     <w:p>
@@ -9245,34 +9261,34 @@
         <w:rPr>
           <w:lang w:val="ru-UA"/>
         </w:rPr>
+        <w:t xml:space="preserve">Source CSV </w:t>
+      </w:r>
+      <w:r>
+        <w:rPr>
+          <w:b/>
+          <w:bCs/>
+          <w:lang w:val="ru-UA"/>
+        </w:rPr>
+        <w:t>не включать</w:t>
+      </w:r>
+      <w:r>
+        <w:rPr>
+          <w:lang w:val="ru-UA"/>
+        </w:rPr>
+        <w:t>.</w:t>
+      </w:r>
+    </w:p>
+    <w:p>
+      <w:pPr>
+        <w:rPr>
+          <w:lang w:val="ru-UA"/>
+        </w:rPr>
+      </w:pPr>
+      <w:r>
+        <w:rPr>
+          <w:lang w:val="ru-UA"/>
+        </w:rPr>
         <w:lastRenderedPageBreak/>
-        <w:t xml:space="preserve">Source CSV </w:t>
-      </w:r>
-      <w:r>
-        <w:rPr>
-          <w:b/>
-          <w:bCs/>
-          <w:lang w:val="ru-UA"/>
-        </w:rPr>
-        <w:t>не включать</w:t>
-      </w:r>
-      <w:r>
-        <w:rPr>
-          <w:lang w:val="ru-UA"/>
-        </w:rPr>
-        <w:t>.</w:t>
-      </w:r>
-    </w:p>
-    <w:p>
-      <w:pPr>
-        <w:rPr>
-          <w:lang w:val="ru-UA"/>
-        </w:rPr>
-      </w:pPr>
-      <w:r>
-        <w:rPr>
-          <w:lang w:val="ru-UA"/>
-        </w:rPr>
         <w:pict w14:anchorId="71F2F383">
           <v:rect id="_x0000_i1047" style="width:0;height:1.5pt" o:hralign="center" o:hrstd="t" o:hr="t" fillcolor="#a0a0a0" stroked="f"/>
         </w:pict>
@@ -10218,7 +10234,6 @@
               <w:rPr>
                 <w:lang w:val="ru-UA"/>
               </w:rPr>
-              <w:lastRenderedPageBreak/>
               <w:t>Clarity</w:t>
             </w:r>
             <w:proofErr w:type="spellEnd"/>
@@ -10258,6 +10273,7 @@
           <w:bCs/>
           <w:lang w:val="ru-UA"/>
         </w:rPr>
+        <w:lastRenderedPageBreak/>
         <w:t>Главный акцент задания — не количество написанного кода, а качество инженерных решений и объяснений.</w:t>
       </w:r>
     </w:p>

</xml_diff>

<commit_message>
feat: Task 2.1 updated. Primary Key added feat: Task 2.4 added chore: AI_USAGE.md, ANSWERS.md, ASSUMPTIONS.md updated
</commit_message>
<xml_diff>
--- a/docs/Разбор задания.docx
+++ b/docs/Разбор задания.docx
@@ -4727,26 +4727,24 @@
           <w:lang w:val="ru-UA"/>
         </w:rPr>
       </w:pPr>
-      <w:r>
-        <w:rPr>
-          <w:lang w:val="ru-UA"/>
-        </w:rPr>
-        <w:t xml:space="preserve">использование относительного показателя </w:t>
-      </w:r>
-      <w:r>
-        <w:rPr>
-          <w:lang w:val="ru-UA"/>
-        </w:rPr>
-        <w:t>ROAS</w:t>
-      </w:r>
-      <w:r>
-        <w:t>_relative</w:t>
-      </w:r>
-      <w:r>
-        <w:rPr>
-          <w:lang w:val="ru-UA"/>
-        </w:rPr>
-        <w:t xml:space="preserve"> = </w:t>
+      <w:bookmarkStart w:id="7" w:name="_Hlk241416352"/>
+      <w:r>
+        <w:rPr>
+          <w:lang w:val="ru-UA"/>
+        </w:rPr>
+        <w:t xml:space="preserve">использование </w:t>
+      </w:r>
+      <w:r>
+        <w:rPr>
+          <w:lang w:val="ru-UA"/>
+        </w:rPr>
+        <w:t>разницы вместо отношения</w:t>
+      </w:r>
+      <w:r>
+        <w:rPr>
+          <w:lang w:val="ru-UA"/>
+        </w:rPr>
+        <w:t xml:space="preserve"> </w:t>
       </w:r>
       <w:r>
         <w:rPr>
@@ -4782,28 +4780,9 @@
         </w:rPr>
         <w:t>)</w:t>
       </w:r>
-      <w:r>
-        <w:rPr>
-          <w:lang w:val="ru-UA"/>
-        </w:rPr>
-        <w:t xml:space="preserve"> / </w:t>
-      </w:r>
-      <w:proofErr w:type="spellStart"/>
-      <w:r>
-        <w:rPr>
-          <w:lang w:val="ru-UA"/>
-        </w:rPr>
-        <w:t>revenue</w:t>
-      </w:r>
-      <w:proofErr w:type="spellEnd"/>
-      <w:r>
-        <w:rPr>
-          <w:lang w:val="ru-UA"/>
-        </w:rPr>
-        <w:t>, для аналитики подойдет</w:t>
-      </w:r>
     </w:p>
     <w:bookmarkEnd w:id="6"/>
+    <w:bookmarkEnd w:id="7"/>
     <w:p>
       <w:pPr>
         <w:rPr>
@@ -4815,7 +4794,7 @@
           <w:lang w:val="ru-UA"/>
         </w:rPr>
         <w:pict w14:anchorId="3C1A0AC3">
-          <v:rect id="_x0000_i1033" style="width:0;height:1.5pt" o:hralign="center" o:hrstd="t" o:hr="t" fillcolor="#a0a0a0" stroked="f"/>
+          <v:rect id="_x0000_i1053" style="width:0;height:1.5pt" o:hralign="center" o:hrstd="t" o:hr="t" fillcolor="#a0a0a0" stroked="f"/>
         </w:pict>
       </w:r>
     </w:p>
@@ -5491,7 +5470,7 @@
           <w:lang w:val="ru-UA"/>
         </w:rPr>
       </w:pPr>
-      <w:bookmarkStart w:id="7" w:name="_Hlk241234810"/>
+      <w:bookmarkStart w:id="8" w:name="_Hlk241234810"/>
       <w:r>
         <w:rPr>
           <w:lang w:val="ru-UA"/>
@@ -5519,7 +5498,7 @@
         </w:rPr>
       </w:pPr>
     </w:p>
-    <w:bookmarkEnd w:id="7"/>
+    <w:bookmarkEnd w:id="8"/>
     <w:p>
       <w:pPr>
         <w:rPr>
@@ -5560,7 +5539,7 @@
           <w:lang w:val="ru-UA"/>
         </w:rPr>
       </w:pPr>
-      <w:bookmarkStart w:id="8" w:name="_Hlk241236023"/>
+      <w:bookmarkStart w:id="9" w:name="_Hlk241236023"/>
       <w:r>
         <w:rPr>
           <w:b/>
@@ -6082,7 +6061,7 @@
           <w:lang w:val="ru-UA"/>
         </w:rPr>
       </w:pPr>
-      <w:bookmarkStart w:id="9" w:name="_Hlk241236900"/>
+      <w:bookmarkStart w:id="10" w:name="_Hlk241236900"/>
       <w:r>
         <w:rPr>
           <w:lang w:val="ru-UA"/>
@@ -6102,7 +6081,7 @@
         <w:t>:</w:t>
       </w:r>
     </w:p>
-    <w:bookmarkEnd w:id="9"/>
+    <w:bookmarkEnd w:id="10"/>
     <w:p>
       <w:pPr>
         <w:rPr>
@@ -7007,7 +6986,7 @@
         <w:t>для всех опасных случаев.</w:t>
       </w:r>
     </w:p>
-    <w:bookmarkEnd w:id="8"/>
+    <w:bookmarkEnd w:id="9"/>
     <w:p>
       <w:pPr>
         <w:rPr>
@@ -7102,7 +7081,7 @@
           <w:lang w:val="ru-UA"/>
         </w:rPr>
       </w:pPr>
-      <w:bookmarkStart w:id="10" w:name="_Hlk241236064"/>
+      <w:bookmarkStart w:id="11" w:name="_Hlk241236064"/>
       <w:proofErr w:type="spellStart"/>
       <w:r>
         <w:rPr>
@@ -7161,7 +7140,7 @@
         <w:t>.</w:t>
       </w:r>
     </w:p>
-    <w:bookmarkEnd w:id="10"/>
+    <w:bookmarkEnd w:id="11"/>
     <w:p>
       <w:pPr>
         <w:rPr>
@@ -7952,7 +7931,7 @@
           <w:lang w:val="ru-UA"/>
         </w:rPr>
       </w:pPr>
-      <w:bookmarkStart w:id="11" w:name="_Hlk241236594"/>
+      <w:bookmarkStart w:id="12" w:name="_Hlk241236594"/>
       <w:r>
         <w:rPr>
           <w:lang w:val="ru-UA"/>
@@ -7960,7 +7939,7 @@
         <w:t>Решение: составить таблицу переименований с датами</w:t>
       </w:r>
     </w:p>
-    <w:bookmarkEnd w:id="11"/>
+    <w:bookmarkEnd w:id="12"/>
     <w:p>
       <w:pPr>
         <w:rPr>
@@ -8384,7 +8363,7 @@
           <w:lang w:val="ru-UA"/>
         </w:rPr>
       </w:pPr>
-      <w:bookmarkStart w:id="12" w:name="_Hlk241237017"/>
+      <w:bookmarkStart w:id="13" w:name="_Hlk241237017"/>
       <w:r>
         <w:rPr>
           <w:lang w:val="ru-UA"/>
@@ -8484,7 +8463,7 @@
         <w:t>.</w:t>
       </w:r>
     </w:p>
-    <w:bookmarkEnd w:id="12"/>
+    <w:bookmarkEnd w:id="13"/>
     <w:p>
       <w:pPr>
         <w:rPr>
@@ -8910,7 +8889,7 @@
       </w:r>
     </w:p>
     <w:p>
-      <w:bookmarkStart w:id="13" w:name="_Hlk241237437"/>
+      <w:bookmarkStart w:id="14" w:name="_Hlk241237437"/>
       <w:r>
         <w:rPr>
           <w:lang w:val="ru-UA"/>
@@ -8918,7 +8897,7 @@
         <w:t>Варианты: исходить из логики работы и выдачи результатов конвейером.</w:t>
       </w:r>
     </w:p>
-    <w:bookmarkEnd w:id="13"/>
+    <w:bookmarkEnd w:id="14"/>
     <w:p>
       <w:pPr>
         <w:rPr>
@@ -9135,7 +9114,7 @@
           <w:lang w:val="ru-UA"/>
         </w:rPr>
       </w:pPr>
-      <w:bookmarkStart w:id="14" w:name="_Hlk241237585"/>
+      <w:bookmarkStart w:id="15" w:name="_Hlk241237585"/>
       <w:r>
         <w:rPr>
           <w:lang w:val="ru-UA"/>
@@ -9163,7 +9142,7 @@
         <w:t>ANSWERS.md</w:t>
       </w:r>
     </w:p>
-    <w:bookmarkEnd w:id="14"/>
+    <w:bookmarkEnd w:id="15"/>
     <w:p>
       <w:pPr>
         <w:rPr>
@@ -9409,14 +9388,14 @@
           <w:lang w:val="ru-UA"/>
         </w:rPr>
       </w:pPr>
-      <w:bookmarkStart w:id="15" w:name="_Hlk241237654"/>
+      <w:bookmarkStart w:id="16" w:name="_Hlk241237654"/>
       <w:r>
         <w:rPr>
           <w:lang w:val="ru-UA"/>
         </w:rPr>
         <w:t>логика обработки</w:t>
       </w:r>
-      <w:bookmarkEnd w:id="15"/>
+      <w:bookmarkEnd w:id="16"/>
       <w:r>
         <w:rPr>
           <w:lang w:val="ru-UA"/>
@@ -9508,7 +9487,7 @@
           <w:lang w:val="ru-UA"/>
         </w:rPr>
       </w:pPr>
-      <w:bookmarkStart w:id="16" w:name="_Hlk241237706"/>
+      <w:bookmarkStart w:id="17" w:name="_Hlk241237706"/>
       <w:r>
         <w:rPr>
           <w:lang w:val="ru-UA"/>
@@ -9614,7 +9593,7 @@
         <w:t xml:space="preserve"> 2026-01-01</w:t>
       </w:r>
     </w:p>
-    <w:bookmarkEnd w:id="16"/>
+    <w:bookmarkEnd w:id="17"/>
     <w:p>
       <w:pPr>
         <w:numPr>

</xml_diff>